<commit_message>
BSI.IT.27.C7: limit final package strictly to period 07/2025-06/2026
- Remove 2026 Q2 (after period) from walkthrough, WP2 and Sample of 1
- Exceptions now 16 accounts (in-period only); results unchanged
- Drop subsequent-period folder; Q2_2026 workbook kept outside the final folder
- Index updated

Co-Authored-By: Claude Opus 5.5 <noreply@anthropic.com>
Claude-Session: https://claude.ai/code/session_01GtAt3iBzX5VYFEMTgXwPkP
</commit_message>
<xml_diff>
--- a/BSI.IT.27.C7 Network Device Admin Accoun/BSI.IT.27.C7 Final 07.2025-06.2026/00 Final Workpaper/BSI.IT.27.C7.04 Sample of 1 - 2026 Q1 Network Device Admin Account Review.docx
+++ b/BSI.IT.27.C7 Network Device Admin Accoun/BSI.IT.27.C7 Final 07.2025-06.2026/00 Final Workpaper/BSI.IT.27.C7.04 Sample of 1 - 2026 Q1 Network Device Admin Account Review.docx
@@ -596,7 +596,7 @@
     </w:p>
     <w:p>
       <w:r>
-        <w:t xml:space="preserve">IT RCSA reviewed the 2026 Q1 PAM BSI SOX access certification for the four privileged network AD groups defined in section 3.3 of the PAM Definition of Privilege, the BSI Active Directory extract of May 15, 2026, the Netwrix revocation logs and the 2025 Q3 evidence. All 61 memberships (51 users / administrators and 10 service accounts) were included in the certification and reconcile to Active Directory, were reviewed by the user's line manager or the account owner, and received a final decision; the three revocations were removed within one day. However, 30 memberships in CISCO Network Administrators and ISEAdmin were approved on April 30, 2026 although the AD account had been disabled since April 2-3, 2026 (E1), the identity carried an IAMS termination date of 12/31/2024 (E2), or the membership had been revoked in the 2025 Q3 review and re-granted without an approved request (E3). The sample assessment result is Fail. Sample 1 (2025 Q3) also failed and the 2026 Q2 certification (after the period) shows the same exceptions.</w:t>
+        <w:t xml:space="preserve">IT RCSA reviewed the 2026 Q1 PAM BSI SOX access certification for the four privileged network AD groups defined in section 3.3 of the PAM Definition of Privilege, the BSI Active Directory extract of May 15, 2026, the Netwrix revocation logs and the 2025 Q3 evidence. All 61 memberships (51 users / administrators and 10 service accounts) were included in the certification and reconcile to Active Directory, were reviewed by the user's line manager or the account owner, and received a final decision; the three revocations were removed within one day. However, 30 memberships in CISCO Network Administrators and ISEAdmin were approved on April 30, 2026 although the AD account had been disabled since April 2-3, 2026 (E1), the identity carried an IAMS termination date of 12/31/2024 (E2), or the membership had been revoked in the 2025 Q3 review and re-granted without an approved request (E3). The sample assessment result is Fail. Sample 1 (2025 Q3) also failed.</w:t>
       </w:r>
     </w:p>
     <w:p>
@@ -1329,7 +1329,7 @@
               <w:rPr>
                 <w:sz w:val="16"/>
               </w:rPr>
-              <w:t xml:space="preserve">Certifications in the period: 2025 Q3 (launched August 1, 2025) and 2026 Q1 (launched April 9, 2026); 2025 Q4 not provided; 2026 Q2 launched July 22, 2026 (after the period).</w:t>
+              <w:t xml:space="preserve">Certifications in the period: 2025 Q3 (launched August 1, 2025) and 2026 Q1 (launched April 9, 2026); 2025 Q4 not provided.</w:t>
             </w:r>
           </w:p>
         </w:tc>
@@ -2056,7 +2056,7 @@
           <w:color w:val="1F1F1F"/>
           <w:sz w:val="19"/>
         </w:rPr>
-        <w:t xml:space="preserve">The referenced workbook (BSI.IT.27.C7.02 Q1 2026 Cert.xlsx, provided in BSI.IT.27.C7 Final 07.2025-06.2026) contains the population, Active Directory and revocation evidence for this sample; BSI.IT.27.C7.05 Testing Walkthrough documents the testing step by step. The summary below allows a reviewer to trace each conclusion without interpreting the workbooks independently.</w:t>
+        <w:t xml:space="preserve">The referenced workbook (BSI.IT.27.C7.02 Q1 2026 Cert.xlsx, provided in BSI.IT.27.C7 Final 07.2025-06.2026 / 02 Evidence 07.2025-06.2026) contains the population, Active Directory and revocation evidence for this sample; BSI.IT.27.C7.05 Testing Walkthrough documents the testing step by step. The summary below allows a reviewer to trace each conclusion without interpreting the workbooks independently.</w:t>
       </w:r>
     </w:p>
     <w:tbl>
@@ -2622,7 +2622,7 @@
                 <w:color w:val="1F1F1F"/>
                 <w:sz w:val="16"/>
               </w:rPr>
-              <w:t xml:space="preserve">Attribute table for Sample 1 (2025 Q3), Sample 2 (2026 Q1) and 2026 Q2 (corroborative).</w:t>
+              <w:t xml:space="preserve">Attribute table for Sample 1 (2025 Q3) and Sample 2 (2026 Q1).</w:t>
             </w:r>
           </w:p>
         </w:tc>
@@ -3258,7 +3258,7 @@
               <w:rPr>
                 <w:sz w:val="17"/>
               </w:rPr>
-              <w:t xml:space="preserve">BSI.IT.27.C7.03 PAM Definition of Privilege.pdf (v10.0)</w:t>
+              <w:t xml:space="preserve">BSI.IT.27.C7 Final 07.2025-06.2026 / 01 Policies and Procedures / BSI.IT.27.C7.03 PAM Definition of Privilege.pdf (v10.0)</w:t>
             </w:r>
           </w:p>
         </w:tc>
@@ -3563,7 +3563,7 @@
           <w:i/>
           <w:sz w:val="16"/>
         </w:rPr>
-        <w:t xml:space="preserve">Source: 01 Policies and Procedures / BSI.IT.27.C7.03 PAM Definition of Privilege.pdf (page 7); NETWORK ADMINS tab of BSI.IT.27.C7.02 Q1 2026 Cert.xlsx</w:t>
+        <w:t xml:space="preserve">Source: BSI.IT.27.C7 Final 07.2025-06.2026 / 01 Policies and Procedures / BSI.IT.27.C7.03 PAM Definition of Privilege.pdf (page 7); NETWORK ADMINS tab of BSI.IT.27.C7.02 Q1 2026 Cert.xlsx</w:t>
       </w:r>
     </w:p>
     <w:p>
@@ -3644,7 +3644,7 @@
           <w:i/>
           <w:sz w:val="16"/>
         </w:rPr>
-        <w:t xml:space="preserve">Source: BSI.IT.27.C7 Final 07.2025-06.2026 (extract rendered from the source workbook)</w:t>
+        <w:t xml:space="preserve">Source: BSI.IT.27.C7 Final 07.2025-06.2026 / 02 Evidence 07.2025-06.2026 (extract rendered from the source workbook)</w:t>
       </w:r>
     </w:p>
     <w:p>
@@ -3725,7 +3725,7 @@
           <w:i/>
           <w:sz w:val="16"/>
         </w:rPr>
-        <w:t xml:space="preserve">Source: BSI.IT.27.C7 Final 07.2025-06.2026 (extract rendered from the source workbook)</w:t>
+        <w:t xml:space="preserve">Source: BSI.IT.27.C7 Final 07.2025-06.2026 / 02 Evidence 07.2025-06.2026 (extract rendered from the source workbook)</w:t>
       </w:r>
     </w:p>
     <w:p>
@@ -3806,7 +3806,7 @@
           <w:i/>
           <w:sz w:val="16"/>
         </w:rPr>
-        <w:t xml:space="preserve">Source: BSI.IT.27.C7 Final 07.2025-06.2026 (extract rendered from the source workbook)</w:t>
+        <w:t xml:space="preserve">Source: BSI.IT.27.C7 Final 07.2025-06.2026 / 02 Evidence 07.2025-06.2026 (extract rendered from the source workbook)</w:t>
       </w:r>
     </w:p>
     <w:p>
@@ -3887,7 +3887,7 @@
           <w:i/>
           <w:sz w:val="16"/>
         </w:rPr>
-        <w:t xml:space="preserve">Source: BSI.IT.27.C7 Final 07.2025-06.2026 (extract rendered from the source workbook)</w:t>
+        <w:t xml:space="preserve">Source: BSI.IT.27.C7 Final 07.2025-06.2026 / 02 Evidence 07.2025-06.2026 (extract rendered from the source workbook)</w:t>
       </w:r>
     </w:p>
     <w:p>
@@ -3968,7 +3968,7 @@
           <w:i/>
           <w:sz w:val="16"/>
         </w:rPr>
-        <w:t xml:space="preserve">Source: BSI.IT.27.C7 Final 07.2025-06.2026 (extract rendered from the source workbook)</w:t>
+        <w:t xml:space="preserve">Source: BSI.IT.27.C7 Final 07.2025-06.2026 / 02 Evidence 07.2025-06.2026 (extract rendered from the source workbook)</w:t>
       </w:r>
     </w:p>
     <w:p>
@@ -4035,20 +4035,6 @@
       </w:r>
     </w:p>
     <w:p>
-      <w:pPr>
-        <w:pStyle w:val="ListBullet"/>
-        <w:spacing w:after="20" w:line="240" w:lineRule="auto"/>
-        <w:ind w:left="259" w:hanging="173"/>
-      </w:pPr>
-      <w:r>
-        <w:rPr>
-          <w:color w:val="1F1F1F"/>
-          <w:sz w:val="17"/>
-        </w:rPr>
-        <w:t xml:space="preserve">2026 Q2 certification launched July 22, 2026 - after the period, used only as corroborative evidence</w:t>
-      </w:r>
-    </w:p>
-    <w:p>
       <w:r>
         <w:t xml:space="preserve">Result: Pass (population); Pass with observation (frequency)</w:t>
       </w:r>
@@ -4104,7 +4090,7 @@
       <w:r>
         <w:drawing>
           <wp:inline xmlns:a="http://schemas.openxmlformats.org/drawingml/2006/main" xmlns:pic="http://schemas.openxmlformats.org/drawingml/2006/picture">
-            <wp:extent cx="6309360" cy="1144345"/>
+            <wp:extent cx="6309360" cy="1043533"/>
             <wp:docPr id="8" name="Picture 8"/>
             <wp:cNvGraphicFramePr>
               <a:graphicFrameLocks noChangeAspect="1"/>
@@ -4125,7 +4111,7 @@
                   <pic:spPr>
                     <a:xfrm>
                       <a:off x="0" y="0"/>
-                      <a:ext cx="6309360" cy="1144345"/>
+                      <a:ext cx="6309360" cy="1043533"/>
                     </a:xfrm>
                     <a:prstGeom prst="rect"/>
                   </pic:spPr>
@@ -4145,7 +4131,7 @@
           <w:i/>
           <w:sz w:val="16"/>
         </w:rPr>
-        <w:t xml:space="preserve">Source: BSI.IT.27.C7 Final 07.2025-06.2026 - BSI.IT.27.C7.02 Q1 2026 Cert.xlsx and Q3_2025.xlsx; 2026 Q2 certification exports.</w:t>
+        <w:t xml:space="preserve">Source: BSI.IT.27.C7 Final 07.2025-06.2026 / 02 Evidence 07.2025-06.2026 - BSI.IT.27.C7.02 Q1 2026 Cert.xlsx and BSI.IT.27.C7.02 Q3_2025.xlsx.</w:t>
       </w:r>
     </w:p>
     <w:p>

</xml_diff>